<commit_message>
fix: docx fonts Aptos→Helvetica (macOS Pages warning)
</commit_message>
<xml_diff>
--- a/linkedin-posts/Quality-Operating-Model/29-policy-half-SEND.docx
+++ b/linkedin-posts/Quality-Operating-Model/29-policy-half-SEND.docx
@@ -114,14 +114,14 @@
       <w:pPr>
         <w:pStyle w:val="First Paragraph"/>
         <w:rPr>
-          <w:rFonts w:ascii="Aptos" w:cs="Aptos" w:hAnsi="Aptos" w:eastAsia="Aptos"/>
+          <w:rFonts w:ascii="Helvetica" w:cs="Helvetica" w:hAnsi="Helvetica" w:eastAsia="Helvetica"/>
           <w:i w:val="1"/>
           <w:iCs w:val="1"/>
         </w:rPr>
       </w:pPr>
       <w:r>
         <w:rPr>
-          <w:rFonts w:ascii="Aptos" w:cs="Aptos" w:hAnsi="Aptos" w:eastAsia="Aptos"/>
+          <w:rFonts w:ascii="Helvetica" w:cs="Helvetica" w:hAnsi="Helvetica" w:eastAsia="Helvetica"/>
           <w:i w:val="1"/>
           <w:iCs w:val="1"/>
           <w:rtl w:val="0"/>
@@ -136,7 +136,7 @@
       </w:pPr>
       <w:r>
         <w:rPr>
-          <w:rFonts w:ascii="Aptos" w:cs="Aptos" w:hAnsi="Aptos" w:eastAsia="Aptos"/>
+          <w:rFonts w:ascii="Helvetica" w:cs="Helvetica" w:hAnsi="Helvetica" w:eastAsia="Helvetica"/>
           <w:i w:val="1"/>
           <w:iCs w:val="1"/>
           <w:rtl w:val="0"/>
@@ -172,7 +172,7 @@
       </w:r>
       <w:r>
         <w:rPr>
-          <w:rFonts w:ascii="Aptos" w:cs="Aptos" w:hAnsi="Aptos" w:eastAsia="Aptos"/>
+          <w:rFonts w:ascii="Helvetica" w:cs="Helvetica" w:hAnsi="Helvetica" w:eastAsia="Helvetica"/>
           <w:b w:val="1"/>
           <w:bCs w:val="1"/>
           <w:rtl w:val="0"/>
@@ -199,7 +199,7 @@
       </w:r>
       <w:r>
         <w:rPr>
-          <w:rFonts w:ascii="Aptos" w:cs="Aptos" w:hAnsi="Aptos" w:eastAsia="Aptos"/>
+          <w:rFonts w:ascii="Helvetica" w:cs="Helvetica" w:hAnsi="Helvetica" w:eastAsia="Helvetica"/>
           <w:b w:val="1"/>
           <w:bCs w:val="1"/>
           <w:rtl w:val="0"/>
@@ -324,7 +324,7 @@
       </w:r>
       <w:r>
         <w:rPr>
-          <w:rFonts w:ascii="Aptos" w:cs="Aptos" w:hAnsi="Aptos" w:eastAsia="Aptos"/>
+          <w:rFonts w:ascii="Helvetica" w:cs="Helvetica" w:hAnsi="Helvetica" w:eastAsia="Helvetica"/>
           <w:b w:val="1"/>
           <w:bCs w:val="1"/>
           <w:rtl w:val="0"/>
@@ -534,7 +534,7 @@
             </w:pPr>
             <w:r>
               <w:rPr>
-                <w:rFonts w:ascii="Aptos" w:cs="Aptos" w:hAnsi="Aptos" w:eastAsia="Aptos"/>
+                <w:rFonts w:ascii="Helvetica" w:cs="Helvetica" w:hAnsi="Helvetica" w:eastAsia="Helvetica"/>
                 <w:b w:val="1"/>
                 <w:bCs w:val="1"/>
                 <w:shd w:val="nil" w:color="auto" w:fill="auto"/>
@@ -601,7 +601,7 @@
             </w:pPr>
             <w:r>
               <w:rPr>
-                <w:rFonts w:ascii="Aptos" w:cs="Aptos" w:hAnsi="Aptos" w:eastAsia="Aptos"/>
+                <w:rFonts w:ascii="Helvetica" w:cs="Helvetica" w:hAnsi="Helvetica" w:eastAsia="Helvetica"/>
                 <w:b w:val="1"/>
                 <w:bCs w:val="1"/>
                 <w:shd w:val="nil" w:color="auto" w:fill="auto"/>
@@ -708,7 +708,7 @@
             </w:pPr>
             <w:r>
               <w:rPr>
-                <w:rFonts w:ascii="Aptos" w:cs="Aptos" w:hAnsi="Aptos" w:eastAsia="Aptos"/>
+                <w:rFonts w:ascii="Helvetica" w:cs="Helvetica" w:hAnsi="Helvetica" w:eastAsia="Helvetica"/>
                 <w:b w:val="1"/>
                 <w:bCs w:val="1"/>
                 <w:shd w:val="nil" w:color="auto" w:fill="auto"/>
@@ -775,7 +775,7 @@
             </w:pPr>
             <w:r>
               <w:rPr>
-                <w:rFonts w:ascii="Aptos" w:cs="Aptos" w:hAnsi="Aptos" w:eastAsia="Aptos"/>
+                <w:rFonts w:ascii="Helvetica" w:cs="Helvetica" w:hAnsi="Helvetica" w:eastAsia="Helvetica"/>
                 <w:b w:val="1"/>
                 <w:bCs w:val="1"/>
                 <w:shd w:val="nil" w:color="auto" w:fill="auto"/>
@@ -882,7 +882,7 @@
             </w:pPr>
             <w:r>
               <w:rPr>
-                <w:rFonts w:ascii="Aptos" w:cs="Aptos" w:hAnsi="Aptos" w:eastAsia="Aptos"/>
+                <w:rFonts w:ascii="Helvetica" w:cs="Helvetica" w:hAnsi="Helvetica" w:eastAsia="Helvetica"/>
                 <w:b w:val="1"/>
                 <w:bCs w:val="1"/>
                 <w:shd w:val="nil" w:color="auto" w:fill="auto"/>
@@ -949,7 +949,7 @@
             </w:pPr>
             <w:r>
               <w:rPr>
-                <w:rFonts w:ascii="Aptos" w:cs="Aptos" w:hAnsi="Aptos" w:eastAsia="Aptos"/>
+                <w:rFonts w:ascii="Helvetica" w:cs="Helvetica" w:hAnsi="Helvetica" w:eastAsia="Helvetica"/>
                 <w:b w:val="1"/>
                 <w:bCs w:val="1"/>
                 <w:shd w:val="nil" w:color="auto" w:fill="auto"/>
@@ -1072,7 +1072,7 @@
             </w:pPr>
             <w:r>
               <w:rPr>
-                <w:rFonts w:ascii="Aptos" w:cs="Aptos" w:hAnsi="Aptos" w:eastAsia="Aptos"/>
+                <w:rFonts w:ascii="Helvetica" w:cs="Helvetica" w:hAnsi="Helvetica" w:eastAsia="Helvetica"/>
                 <w:b w:val="1"/>
                 <w:bCs w:val="1"/>
                 <w:shd w:val="nil" w:color="auto" w:fill="auto"/>
@@ -1193,7 +1193,7 @@
       </w:pPr>
       <w:r>
         <w:rPr>
-          <w:rFonts w:ascii="Aptos" w:cs="Aptos" w:hAnsi="Aptos" w:eastAsia="Aptos"/>
+          <w:rFonts w:ascii="Helvetica" w:cs="Helvetica" w:hAnsi="Helvetica" w:eastAsia="Helvetica"/>
           <w:b w:val="1"/>
           <w:bCs w:val="1"/>
           <w:rtl w:val="0"/>
@@ -1299,7 +1299,7 @@
       </w:r>
       <w:r>
         <w:rPr>
-          <w:rFonts w:ascii="Aptos" w:cs="Aptos" w:hAnsi="Aptos" w:eastAsia="Aptos"/>
+          <w:rFonts w:ascii="Helvetica" w:cs="Helvetica" w:hAnsi="Helvetica" w:eastAsia="Helvetica"/>
           <w:b w:val="1"/>
           <w:bCs w:val="1"/>
           <w:rtl w:val="0"/>
@@ -1316,7 +1316,7 @@
       </w:r>
       <w:r>
         <w:rPr>
-          <w:rFonts w:ascii="Aptos" w:cs="Aptos" w:hAnsi="Aptos" w:eastAsia="Aptos"/>
+          <w:rFonts w:ascii="Helvetica" w:cs="Helvetica" w:hAnsi="Helvetica" w:eastAsia="Helvetica"/>
           <w:b w:val="1"/>
           <w:bCs w:val="1"/>
           <w:rtl w:val="0"/>
@@ -1333,7 +1333,7 @@
       </w:r>
       <w:r>
         <w:rPr>
-          <w:rFonts w:ascii="Aptos" w:cs="Aptos" w:hAnsi="Aptos" w:eastAsia="Aptos"/>
+          <w:rFonts w:ascii="Helvetica" w:cs="Helvetica" w:hAnsi="Helvetica" w:eastAsia="Helvetica"/>
           <w:b w:val="1"/>
           <w:bCs w:val="1"/>
           <w:rtl w:val="0"/>
@@ -1996,7 +1996,7 @@
       </w:pPr>
       <w:r>
         <w:rPr>
-          <w:rFonts w:ascii="Aptos" w:cs="Aptos" w:hAnsi="Aptos" w:eastAsia="Aptos"/>
+          <w:rFonts w:ascii="Helvetica" w:cs="Helvetica" w:hAnsi="Helvetica" w:eastAsia="Helvetica"/>
           <w:i w:val="1"/>
           <w:iCs w:val="1"/>
           <w:rtl w:val="0"/>
@@ -2006,7 +2006,7 @@
       </w:r>
       <w:r>
         <w:rPr>
-          <w:rFonts w:ascii="Aptos" w:cs="Aptos" w:hAnsi="Aptos" w:eastAsia="Aptos"/>
+          <w:rFonts w:ascii="Helvetica" w:cs="Helvetica" w:hAnsi="Helvetica" w:eastAsia="Helvetica"/>
           <w:i w:val="1"/>
           <w:iCs w:val="1"/>
           <w:rtl w:val="0"/>
@@ -2016,7 +2016,7 @@
       </w:r>
       <w:r>
         <w:rPr>
-          <w:rFonts w:ascii="Aptos" w:cs="Aptos" w:hAnsi="Aptos" w:eastAsia="Aptos"/>
+          <w:rFonts w:ascii="Helvetica" w:cs="Helvetica" w:hAnsi="Helvetica" w:eastAsia="Helvetica"/>
           <w:i w:val="1"/>
           <w:iCs w:val="1"/>
           <w:rtl w:val="0"/>
@@ -2234,7 +2234,7 @@
       <w:outlineLvl w:val="9"/>
     </w:pPr>
     <w:rPr>
-      <w:rFonts w:ascii="Aptos" w:cs="Aptos" w:hAnsi="Aptos" w:eastAsia="Aptos"/>
+      <w:rFonts w:ascii="Helvetica" w:cs="Helvetica" w:hAnsi="Helvetica" w:eastAsia="Helvetica"/>
       <w:b w:val="0"/>
       <w:bCs w:val="0"/>
       <w:i w:val="0"/>
@@ -2280,7 +2280,7 @@
       <w:outlineLvl w:val="9"/>
     </w:pPr>
     <w:rPr>
-      <w:rFonts w:ascii="Aptos" w:cs="Aptos" w:hAnsi="Aptos" w:eastAsia="Aptos"/>
+      <w:rFonts w:ascii="Helvetica" w:cs="Helvetica" w:hAnsi="Helvetica" w:eastAsia="Helvetica"/>
       <w:b w:val="0"/>
       <w:bCs w:val="0"/>
       <w:i w:val="0"/>
@@ -2324,7 +2324,7 @@
       <w:outlineLvl w:val="9"/>
     </w:pPr>
     <w:rPr>
-      <w:rFonts w:ascii="Aptos" w:cs="Aptos" w:hAnsi="Aptos" w:eastAsia="Aptos"/>
+      <w:rFonts w:ascii="Helvetica" w:cs="Helvetica" w:hAnsi="Helvetica" w:eastAsia="Helvetica"/>
       <w:b w:val="0"/>
       <w:bCs w:val="0"/>
       <w:i w:val="0"/>
@@ -2368,7 +2368,7 @@
       <w:outlineLvl w:val="0"/>
     </w:pPr>
     <w:rPr>
-      <w:rFonts w:ascii="Aptos Display" w:cs="Aptos Display" w:hAnsi="Aptos Display" w:eastAsia="Aptos Display"/>
+      <w:rFonts w:ascii="Helvetica Neue" w:cs="Helvetica Neue" w:hAnsi="Helvetica Neue" w:eastAsia="Helvetica Neue"/>
       <w:b w:val="0"/>
       <w:bCs w:val="0"/>
       <w:i w:val="0"/>
@@ -2414,7 +2414,7 @@
       <w:outlineLvl w:val="1"/>
     </w:pPr>
     <w:rPr>
-      <w:rFonts w:ascii="Aptos Display" w:cs="Aptos Display" w:hAnsi="Aptos Display" w:eastAsia="Aptos Display"/>
+      <w:rFonts w:ascii="Helvetica Neue" w:cs="Helvetica Neue" w:hAnsi="Helvetica Neue" w:eastAsia="Helvetica Neue"/>
       <w:b w:val="0"/>
       <w:bCs w:val="0"/>
       <w:i w:val="0"/>
@@ -2460,7 +2460,7 @@
       <w:outlineLvl w:val="9"/>
     </w:pPr>
     <w:rPr>
-      <w:rFonts w:ascii="Aptos" w:cs="Aptos" w:hAnsi="Aptos" w:eastAsia="Aptos"/>
+      <w:rFonts w:ascii="Helvetica" w:cs="Helvetica" w:hAnsi="Helvetica" w:eastAsia="Helvetica"/>
       <w:b w:val="0"/>
       <w:bCs w:val="0"/>
       <w:i w:val="0"/>

</xml_diff>